<commit_message>
Dokumentace: název The Last Beacon ve Wordech + interaktivní prezentace
Prezentace: navigační lišta, galerie se zvětšováním (Morph), klikací schéma
architektury, rozcestník pro dotazy, přechody a skryté slidy.

Co-Authored-By: Claude Sonnet 5.5 <noreply@anthropic.com>
</commit_message>
<xml_diff>
--- a/Dokumentace/Plan_rocnikove_prace.docx
+++ b/Dokumentace/Plan_rocnikove_prace.docx
@@ -15,7 +15,7 @@
           <w:sz w:val="36"/>
           <w:szCs w:val="36"/>
         </w:rPr>
-        <w:t xml:space="preserve">Plán ročníkové (maturitní) práce – Poslední maják</w:t>
+        <w:t xml:space="preserve">Plán ročníkové (maturitní) práce – The Last Beacon</w:t>
       </w:r>
     </w:p>
     <w:p>
@@ -3409,6 +3409,21 @@
   <w:style w:type="paragraph" w:styleId="Normal" w:default="1">
     <w:name w:val="Normal"/>
     <w:qFormat/>
+  </w:style>
+  <w:style w:type="table" w:styleId="TableNormal" w:default="true">
+    <w:name w:val="Normal Table"/>
+    <w:uiPriority w:val="99"/>
+    <w:semiHidden/>
+    <w:unhideWhenUsed/>
+    <w:tblPr>
+      <w:tblInd w:type="dxa" w:w="0"/>
+      <w:tblCellMar>
+        <w:top w:type="dxa" w:w="0"/>
+        <w:left w:type="dxa" w:w="108"/>
+        <w:bottom w:type="dxa" w:w="0"/>
+        <w:right w:type="dxa" w:w="108"/>
+      </w:tblCellMar>
+    </w:tblPr>
   </w:style>
   <w:style w:type="paragraph" w:styleId="Title">
     <w:name w:val="Title"/>

</xml_diff>